<commit_message>
Update Legal_AI_Full_Reference.docx for current system
Regenerated the reference doc (and its generator) to reflect: the agentic
chat mode (orchestrator calls named sub-agents as tools) vs. the fixed
pipeline; the four exact output-header templates (citizen / lawyer / judge
/ case study, Arabic verbatim + FR/EN equivalents); the Criminal Procedure
Code added to the corpus (now 1,144 indexed docs: 659 Penal + 431 CPC + 54
rulings) with per-code citation disambiguation; the Chat Assistant UI
(live sub-agent steps, saved conversations, collapsed Sources panel,
token/spend); and Claude Sonnet 5 as the default model (temp 0, threshold 0.7).

Co-Authored-By: Claude Opus 4.8 <noreply@anthropic.com>
</commit_message>
<xml_diff>
--- a/Legal_AI_Full_Reference.docx
+++ b/Legal_AI_Full_Reference.docx
@@ -35,7 +35,7 @@
         <w:rPr>
           <w:i/>
         </w:rPr>
-        <w:t>Reference document for the advisor presentation · July 28, 2026</w:t>
+        <w:t>Reference document for the advisor presentation · August 02, 2026</w:t>
       </w:r>
     </w:p>
     <w:p>
@@ -65,6 +65,19 @@
     </w:p>
     <w:p>
       <w:pPr>
+        <w:spacing w:after="120"/>
+      </w:pPr>
+      <w:r>
+        <w:rPr>
+          <w:b w:val="0"/>
+          <w:i/>
+          <w:sz w:val="22"/>
+        </w:rPr>
+        <w:t>The system is delivered two ways over the same specialised agents: (a) a conversational CHAT ASSISTANT driven by an agentic orchestrator that calls only the sub-agents a question actually needs, and (b) a fixed END-TO-END PIPELINE that always runs every agent for full transparency. It covers two Lebanese codes — the Penal Code and the Code of Criminal Procedure (قانون أصول المحاكمات الجزائية) — and defaults to Claude Sonnet 5.</w:t>
+      </w:r>
+    </w:p>
+    <w:p>
+      <w:pPr>
         <w:pStyle w:val="Heading1"/>
       </w:pPr>
       <w:r>
@@ -97,7 +110,7 @@
           <w:i w:val="0"/>
           <w:sz w:val="22"/>
         </w:rPr>
-        <w:t>This project answers legal questions by first RETRIEVING the correct law from a curated corpus, then writing a grounded, cited answer whose accuracy can be measured. It is delivered as a web application plus a rigorous, reproducible benchmark.</w:t>
+        <w:t>This project answers legal questions by first RETRIEVING the correct law from a curated corpus, then writing a grounded, cited answer whose accuracy can be measured. It is delivered as a web application (a chat assistant plus a full pipeline view) with a rigorous, reproducible benchmark. The corpus covers the Lebanese Penal Code and the Code of Criminal Procedure, in Arabic (primary) and English.</w:t>
       </w:r>
     </w:p>
     <w:p>
@@ -571,6 +584,117 @@
     </w:p>
     <w:p>
       <w:pPr>
+        <w:pStyle w:val="Heading2"/>
+      </w:pPr>
+      <w:r>
+        <w:rPr>
+          <w:color w:val="1E3A5F"/>
+        </w:rPr>
+        <w:t>2.1 Two execution modes: fixed pipeline vs. agentic chat</w:t>
+      </w:r>
+    </w:p>
+    <w:p>
+      <w:pPr>
+        <w:spacing w:after="120"/>
+      </w:pPr>
+      <w:r>
+        <w:rPr>
+          <w:b w:val="0"/>
+          <w:i w:val="0"/>
+          <w:sz w:val="22"/>
+        </w:rPr>
+        <w:t>The same agents are used in two ways:</w:t>
+      </w:r>
+    </w:p>
+    <w:p>
+      <w:pPr>
+        <w:pStyle w:val="ListBullet"/>
+      </w:pPr>
+      <w:r>
+        <w:rPr>
+          <w:b/>
+        </w:rPr>
+        <w:t xml:space="preserve">Fixed pipeline: </w:t>
+      </w:r>
+      <w:r>
+        <w:t>always runs all seven agents in order. Maximum transparency — every step, its input/output, the retrieved documents, and per-agent cost/latency are shown. Best for demonstration and audit.</w:t>
+      </w:r>
+    </w:p>
+    <w:p>
+      <w:pPr>
+        <w:pStyle w:val="ListBullet"/>
+      </w:pPr>
+      <w:r>
+        <w:rPr>
+          <w:b/>
+        </w:rPr>
+        <w:t xml:space="preserve">Agentic chat: </w:t>
+      </w:r>
+      <w:r>
+        <w:t>a conversational assistant where the Orchestrator is given the sub-agents as TOOLS and calls ONLY the ones a given question needs — a simple citizen question may need one Research call; a complex case may chain Research → Analysis → Citation. This saves time and tokens and behaves more intelligently, while the named sub-agents (Research, Analysis, Citation) still run and are shown live, step by step. Multi-turn, with saved conversations.</w:t>
+      </w:r>
+    </w:p>
+    <w:p>
+      <w:pPr>
+        <w:spacing w:after="40"/>
+      </w:pPr>
+      <w:r>
+        <w:rPr>
+          <w:b/>
+          <w:i w:val="0"/>
+          <w:sz w:val="22"/>
+        </w:rPr>
+        <w:t>Sub-agents exposed to the chat orchestrator (as callable tools):</w:t>
+      </w:r>
+    </w:p>
+    <w:p>
+      <w:pPr>
+        <w:shd w:val="clear" w:fill="F1F5F9"/>
+        <w:spacing w:after="160"/>
+        <w:ind w:left="288"/>
+      </w:pPr>
+      <w:r>
+        <w:rPr>
+          <w:rFonts w:ascii="Consolas" w:hAnsi="Consolas"/>
+          <w:color w:val="1E293B"/>
+          <w:sz w:val="19"/>
+        </w:rPr>
+        <w:t>research_agent(query)          -&gt; relevant articles (both codes) + court rulings</w:t>
+      </w:r>
+      <w:r>
+        <w:rPr>
+          <w:rFonts w:ascii="Consolas" w:hAnsi="Consolas"/>
+          <w:color w:val="1E293B"/>
+          <w:sz w:val="19"/>
+        </w:rPr>
+        <w:br/>
+        <w:t>analysis_agent(question)       -&gt; applicable provisions, grounded and explained</w:t>
+      </w:r>
+      <w:r>
+        <w:rPr>
+          <w:rFonts w:ascii="Consolas" w:hAnsi="Consolas"/>
+          <w:color w:val="1E293B"/>
+          <w:sz w:val="19"/>
+        </w:rPr>
+        <w:br/>
+        <w:t>citation_agent(article_nums)   -&gt; verifies article numbers against the corpus</w:t>
+      </w:r>
+    </w:p>
+    <w:p>
+      <w:pPr>
+        <w:spacing w:after="120"/>
+      </w:pPr>
+      <w:r>
+        <w:rPr>
+          <w:b w:val="0"/>
+          <w:i w:val="0"/>
+          <w:sz w:val="22"/>
+        </w:rPr>
+        <w:t>Every retrieved item is labelled with which code it comes from, because the two codes share article numbers (both have an Article 24, 90, 233, …).</w:t>
+      </w:r>
+    </w:p>
+    <w:p>
+      <w:pPr>
         <w:pStyle w:val="Heading1"/>
       </w:pPr>
       <w:r>
@@ -825,7 +949,283 @@
           <w:i w:val="0"/>
           <w:sz w:val="22"/>
         </w:rPr>
-        <w:t>The Orchestrator detects the user type (or the user selects it) and the Writing agent produces the matching output shape:</w:t>
+        <w:t>The Orchestrator detects the user type (or the user selects it) and the Writing agent produces the matching output shape. Each shape uses a FIXED set of section headers, written verbatim and in order (validated by a domain expert). The Arabic headers below are authoritative; French and English use faithful equivalents so the structure is identical across languages.</w:t>
+      </w:r>
+    </w:p>
+    <w:p>
+      <w:pPr>
+        <w:spacing w:after="40"/>
+      </w:pPr>
+      <w:r>
+        <w:rPr>
+          <w:b/>
+          <w:i w:val="0"/>
+          <w:sz w:val="22"/>
+        </w:rPr>
+        <w:t>Citizen — a plain question (two parts):</w:t>
+      </w:r>
+    </w:p>
+    <w:p>
+      <w:pPr>
+        <w:shd w:val="clear" w:fill="F1F5F9"/>
+        <w:spacing w:after="160"/>
+        <w:ind w:left="288"/>
+      </w:pPr>
+      <w:r>
+        <w:rPr>
+          <w:rFonts w:ascii="Consolas" w:hAnsi="Consolas"/>
+          <w:color w:val="1E293B"/>
+          <w:sz w:val="19"/>
+        </w:rPr>
+        <w:t>التحليل القانوني        (Legal Analysis)</w:t>
+      </w:r>
+      <w:r>
+        <w:rPr>
+          <w:rFonts w:ascii="Consolas" w:hAnsi="Consolas"/>
+          <w:color w:val="1E293B"/>
+          <w:sz w:val="19"/>
+        </w:rPr>
+        <w:br/>
+        <w:t>الإجابة باختصار         (Answer in Brief)</w:t>
+      </w:r>
+    </w:p>
+    <w:p>
+      <w:pPr>
+        <w:spacing w:after="40"/>
+      </w:pPr>
+      <w:r>
+        <w:rPr>
+          <w:b/>
+          <w:i w:val="0"/>
+          <w:sz w:val="22"/>
+        </w:rPr>
+        <w:t>Lawyer — defending a client's case:</w:t>
+      </w:r>
+    </w:p>
+    <w:p>
+      <w:pPr>
+        <w:shd w:val="clear" w:fill="F1F5F9"/>
+        <w:spacing w:after="160"/>
+        <w:ind w:left="288"/>
+      </w:pPr>
+      <w:r>
+        <w:rPr>
+          <w:rFonts w:ascii="Consolas" w:hAnsi="Consolas"/>
+          <w:color w:val="1E293B"/>
+          <w:sz w:val="19"/>
+        </w:rPr>
+        <w:t>الوقائع المنتجة              (Relevant Facts)</w:t>
+      </w:r>
+      <w:r>
+        <w:rPr>
+          <w:rFonts w:ascii="Consolas" w:hAnsi="Consolas"/>
+          <w:color w:val="1E293B"/>
+          <w:sz w:val="19"/>
+        </w:rPr>
+        <w:br/>
+        <w:t>القوانين والمواد ذات الصلة   (Applicable Laws &amp; Articles)</w:t>
+      </w:r>
+      <w:r>
+        <w:rPr>
+          <w:rFonts w:ascii="Consolas" w:hAnsi="Consolas"/>
+          <w:color w:val="1E293B"/>
+          <w:sz w:val="19"/>
+        </w:rPr>
+        <w:br/>
+        <w:t>طريقة الدفاع                 (Defense Strategy)</w:t>
+      </w:r>
+      <w:r>
+        <w:rPr>
+          <w:rFonts w:ascii="Consolas" w:hAnsi="Consolas"/>
+          <w:color w:val="1E293B"/>
+          <w:sz w:val="19"/>
+        </w:rPr>
+        <w:br/>
+        <w:t>الإجابة باختصار             (Answer in Brief)</w:t>
+      </w:r>
+    </w:p>
+    <w:p>
+      <w:pPr>
+        <w:spacing w:after="40"/>
+      </w:pPr>
+      <w:r>
+        <w:rPr>
+          <w:b/>
+          <w:i w:val="0"/>
+          <w:sz w:val="22"/>
+        </w:rPr>
+        <w:t>Judge — facts given, ruling expected:</w:t>
+      </w:r>
+    </w:p>
+    <w:p>
+      <w:pPr>
+        <w:shd w:val="clear" w:fill="F1F5F9"/>
+        <w:spacing w:after="160"/>
+        <w:ind w:left="288"/>
+      </w:pPr>
+      <w:r>
+        <w:rPr>
+          <w:rFonts w:ascii="Consolas" w:hAnsi="Consolas"/>
+          <w:color w:val="1E293B"/>
+          <w:sz w:val="19"/>
+        </w:rPr>
+        <w:t>المحكمة المختصة              (Competent Court)</w:t>
+      </w:r>
+      <w:r>
+        <w:rPr>
+          <w:rFonts w:ascii="Consolas" w:hAnsi="Consolas"/>
+          <w:color w:val="1E293B"/>
+          <w:sz w:val="19"/>
+        </w:rPr>
+        <w:br/>
+        <w:t>أطراف الدعوى                (Parties to the Case)</w:t>
+      </w:r>
+      <w:r>
+        <w:rPr>
+          <w:rFonts w:ascii="Consolas" w:hAnsi="Consolas"/>
+          <w:color w:val="1E293B"/>
+          <w:sz w:val="19"/>
+        </w:rPr>
+        <w:br/>
+        <w:t>الوقائع المنتجة              (Relevant Facts)</w:t>
+      </w:r>
+      <w:r>
+        <w:rPr>
+          <w:rFonts w:ascii="Consolas" w:hAnsi="Consolas"/>
+          <w:color w:val="1E293B"/>
+          <w:sz w:val="19"/>
+        </w:rPr>
+        <w:br/>
+        <w:t>القوانين والمواد ذات الصلة   (Applicable Laws &amp; Articles)</w:t>
+      </w:r>
+      <w:r>
+        <w:rPr>
+          <w:rFonts w:ascii="Consolas" w:hAnsi="Consolas"/>
+          <w:color w:val="1E293B"/>
+          <w:sz w:val="19"/>
+        </w:rPr>
+        <w:br/>
+        <w:t>تطبيق القانون على الوقائع    (Application of Law to Facts)</w:t>
+      </w:r>
+      <w:r>
+        <w:rPr>
+          <w:rFonts w:ascii="Consolas" w:hAnsi="Consolas"/>
+          <w:color w:val="1E293B"/>
+          <w:sz w:val="19"/>
+        </w:rPr>
+        <w:br/>
+        <w:t>الحكم                        (Judgment)</w:t>
+      </w:r>
+    </w:p>
+    <w:p>
+      <w:pPr>
+        <w:spacing w:after="40"/>
+      </w:pPr>
+      <w:r>
+        <w:rPr>
+          <w:b/>
+          <w:i w:val="0"/>
+          <w:sz w:val="22"/>
+        </w:rPr>
+        <w:t>Case study — a general question / neutral analysis (no specific role):</w:t>
+      </w:r>
+    </w:p>
+    <w:p>
+      <w:pPr>
+        <w:shd w:val="clear" w:fill="F1F5F9"/>
+        <w:spacing w:after="160"/>
+        <w:ind w:left="288"/>
+      </w:pPr>
+      <w:r>
+        <w:rPr>
+          <w:rFonts w:ascii="Consolas" w:hAnsi="Consolas"/>
+          <w:color w:val="1E293B"/>
+          <w:sz w:val="19"/>
+        </w:rPr>
+        <w:t>الوقائع المنتجة              (Relevant Facts)</w:t>
+      </w:r>
+      <w:r>
+        <w:rPr>
+          <w:rFonts w:ascii="Consolas" w:hAnsi="Consolas"/>
+          <w:color w:val="1E293B"/>
+          <w:sz w:val="19"/>
+        </w:rPr>
+        <w:br/>
+        <w:t>الاشكالية القانونية          (Legal Issue)</w:t>
+      </w:r>
+      <w:r>
+        <w:rPr>
+          <w:rFonts w:ascii="Consolas" w:hAnsi="Consolas"/>
+          <w:color w:val="1E293B"/>
+          <w:sz w:val="19"/>
+        </w:rPr>
+        <w:br/>
+        <w:t>المواد والقوانين ذات الصلة   (Applicable Laws &amp; Articles)</w:t>
+      </w:r>
+      <w:r>
+        <w:rPr>
+          <w:rFonts w:ascii="Consolas" w:hAnsi="Consolas"/>
+          <w:color w:val="1E293B"/>
+          <w:sz w:val="19"/>
+        </w:rPr>
+        <w:br/>
+        <w:t>تطبيق القانون على الوقائع    (Application of Law to Facts)</w:t>
+      </w:r>
+      <w:r>
+        <w:rPr>
+          <w:rFonts w:ascii="Consolas" w:hAnsi="Consolas"/>
+          <w:color w:val="1E293B"/>
+          <w:sz w:val="19"/>
+        </w:rPr>
+        <w:br/>
+        <w:t>الحل                         (Solution)</w:t>
+      </w:r>
+      <w:r>
+        <w:rPr>
+          <w:rFonts w:ascii="Consolas" w:hAnsi="Consolas"/>
+          <w:color w:val="1E293B"/>
+          <w:sz w:val="19"/>
+        </w:rPr>
+        <w:br/>
+        <w:t>المحكمة المختصة (في حال وجودها)  (Competent Court, if applicable)</w:t>
+      </w:r>
+    </w:p>
+    <w:p>
+      <w:pPr>
+        <w:spacing w:after="120"/>
+      </w:pPr>
+      <w:r>
+        <w:rPr>
+          <w:b w:val="0"/>
+          <w:i w:val="0"/>
+          <w:sz w:val="22"/>
+        </w:rPr>
+        <w:t>Auto-detect infers the role from the phrasing (e.g. 'my client' → lawyer, 'render the verdict' → judge). Both the fixed pipeline and the agentic chat enforce these same templates.</w:t>
+      </w:r>
+    </w:p>
+    <w:p>
+      <w:pPr>
+        <w:pStyle w:val="Heading1"/>
+      </w:pPr>
+      <w:r>
+        <w:rPr>
+          <w:color w:val="1E3A5F"/>
+        </w:rPr>
+        <w:t>5. Corpus &amp; Data Foundation</w:t>
+      </w:r>
+    </w:p>
+    <w:p>
+      <w:pPr>
+        <w:pStyle w:val="ListBullet"/>
+      </w:pPr>
+      <w:r>
+        <w:rPr>
+          <w:b/>
+        </w:rPr>
+        <w:t xml:space="preserve">Corpus: </w:t>
+      </w:r>
+      <w:r>
+        <w:t>two Lebanese codes plus case law — Penal Code (417 Arabic + 242 English articles), Code of Criminal Procedure (431 Arabic articles), and 54 Court of Cassation rulings = 1,144 indexed documents.</w:t>
       </w:r>
     </w:p>
     <w:tbl>
@@ -850,7 +1250,7 @@
                 <w:b/>
                 <w:sz w:val="20"/>
               </w:rPr>
-              <w:t>User</w:t>
+              <w:t>Source</w:t>
             </w:r>
           </w:p>
         </w:tc>
@@ -864,7 +1264,7 @@
                 <w:b/>
                 <w:sz w:val="20"/>
               </w:rPr>
-              <w:t>Situation</w:t>
+              <w:t>Articles / docs</w:t>
             </w:r>
           </w:p>
         </w:tc>
@@ -878,7 +1278,7 @@
                 <w:b/>
                 <w:sz w:val="20"/>
               </w:rPr>
-              <w:t>Output shape</w:t>
+              <w:t>Language</w:t>
             </w:r>
           </w:p>
         </w:tc>
@@ -894,7 +1294,7 @@
                 <w:b/>
                 <w:sz w:val="20"/>
               </w:rPr>
-              <w:t>Citizen</w:t>
+              <w:t>Penal Code (قانون العقوبات)</w:t>
             </w:r>
           </w:p>
         </w:tc>
@@ -907,7 +1307,7 @@
               <w:rPr>
                 <w:sz w:val="20"/>
               </w:rPr>
-              <w:t>A general legal question</w:t>
+              <w:t>659 (417 AR + 242 EN)</w:t>
             </w:r>
           </w:p>
         </w:tc>
@@ -920,7 +1320,7 @@
               <w:rPr>
                 <w:sz w:val="20"/>
               </w:rPr>
-              <w:t>A plain, jargon-free answer.</w:t>
+              <w:t>Arabic + English</w:t>
             </w:r>
           </w:p>
         </w:tc>
@@ -936,7 +1336,7 @@
                 <w:b/>
                 <w:sz w:val="20"/>
               </w:rPr>
-              <w:t>Lawyer</w:t>
+              <w:t>Code of Criminal Procedure (أصول المحاكمات الجزائية)</w:t>
             </w:r>
           </w:p>
         </w:tc>
@@ -949,7 +1349,7 @@
               <w:rPr>
                 <w:sz w:val="20"/>
               </w:rPr>
-              <w:t>A question or a client's case</w:t>
+              <w:t>431</w:t>
             </w:r>
           </w:p>
         </w:tc>
@@ -962,7 +1362,7 @@
               <w:rPr>
                 <w:sz w:val="20"/>
               </w:rPr>
-              <w:t>A structured advisory memorandum (defence-oriented).</w:t>
+              <w:t>Arabic</w:t>
             </w:r>
           </w:p>
         </w:tc>
@@ -978,7 +1378,7 @@
                 <w:b/>
                 <w:sz w:val="20"/>
               </w:rPr>
-              <w:t>Judge</w:t>
+              <w:t>Court of Cassation rulings</w:t>
             </w:r>
           </w:p>
         </w:tc>
@@ -991,7 +1391,7 @@
               <w:rPr>
                 <w:sz w:val="20"/>
               </w:rPr>
-              <w:t>Gives the facts, wants the ruling</w:t>
+              <w:t>54</w:t>
             </w:r>
           </w:p>
         </w:tc>
@@ -1004,7 +1404,49 @@
               <w:rPr>
                 <w:sz w:val="20"/>
               </w:rPr>
-              <w:t>A formal judicial DECISION: facts → law → reasoning → verdict.</w:t>
+              <w:t>Arabic</w:t>
+            </w:r>
+          </w:p>
+        </w:tc>
+      </w:tr>
+      <w:tr>
+        <w:tc>
+          <w:tcPr>
+            <w:tcW w:type="dxa" w:w="2880"/>
+          </w:tcPr>
+          <w:p>
+            <w:r>
+              <w:rPr>
+                <w:b/>
+                <w:sz w:val="20"/>
+              </w:rPr>
+              <w:t>Total indexed</w:t>
+            </w:r>
+          </w:p>
+        </w:tc>
+        <w:tc>
+          <w:tcPr>
+            <w:tcW w:type="dxa" w:w="2880"/>
+          </w:tcPr>
+          <w:p>
+            <w:r>
+              <w:rPr>
+                <w:sz w:val="20"/>
+              </w:rPr>
+              <w:t>1,144 documents</w:t>
+            </w:r>
+          </w:p>
+        </w:tc>
+        <w:tc>
+          <w:tcPr>
+            <w:tcW w:type="dxa" w:w="2880"/>
+          </w:tcPr>
+          <w:p>
+            <w:r>
+              <w:rPr>
+                <w:sz w:val="20"/>
+              </w:rPr>
+              <w:t>—</w:t>
             </w:r>
           </w:p>
         </w:tc>
@@ -1013,44 +1455,6 @@
     <w:p/>
     <w:p>
       <w:pPr>
-        <w:spacing w:after="120"/>
-      </w:pPr>
-      <w:r>
-        <w:rPr>
-          <w:b w:val="0"/>
-          <w:i w:val="0"/>
-          <w:sz w:val="22"/>
-        </w:rPr>
-        <w:t>Auto-detect infers the role from the phrasing (e.g. 'my client' → lawyer, 'render the verdict' → judge). The section headings are language-specific (Arabic / French / English).</w:t>
-      </w:r>
-    </w:p>
-    <w:p>
-      <w:pPr>
-        <w:pStyle w:val="Heading1"/>
-      </w:pPr>
-      <w:r>
-        <w:rPr>
-          <w:color w:val="1E3A5F"/>
-        </w:rPr>
-        <w:t>5. Corpus &amp; Data Foundation</w:t>
-      </w:r>
-    </w:p>
-    <w:p>
-      <w:pPr>
-        <w:pStyle w:val="ListBullet"/>
-      </w:pPr>
-      <w:r>
-        <w:rPr>
-          <w:b/>
-        </w:rPr>
-        <w:t xml:space="preserve">Bilingual corpus: </w:t>
-      </w:r>
-      <w:r>
-        <w:t>Lebanese Penal Code — 417 Arabic articles + 242 English articles + 54 Court of Cassation rulings = 713 indexed documents.</w:t>
-      </w:r>
-    </w:p>
-    <w:p>
-      <w:pPr>
         <w:pStyle w:val="ListBullet"/>
       </w:pPr>
       <w:r>
@@ -1060,7 +1464,7 @@
         <w:t xml:space="preserve">Ingestion: </w:t>
       </w:r>
       <w:r>
-        <w:t>a reproducible pipeline reads the sources, embeds them into a searchable index, and records exactly what was indexed (a manifest).</w:t>
+        <w:t>a reproducible pipeline (build_index.py) AUTO-DISCOVERS every code file in the documents folder, embeds them into a searchable index, regenerates the citation article index per code, and records exactly what was indexed (a manifest).</w:t>
       </w:r>
     </w:p>
     <w:p>
@@ -1074,7 +1478,21 @@
         <w:t xml:space="preserve">Extensible: </w:t>
       </w:r>
       <w:r>
-        <w:t>new sources (contract law, French texts) are auto-indexed by the same pipeline — no code change needed.</w:t>
+        <w:t>the Code of Criminal Procedure was added simply by dropping its JSON in the corpus folder and re-running the pipeline — no code change was needed for ingestion. Contract law / French texts can be added the same way.</w:t>
+      </w:r>
+    </w:p>
+    <w:p>
+      <w:pPr>
+        <w:pStyle w:val="ListBullet"/>
+      </w:pPr>
+      <w:r>
+        <w:rPr>
+          <w:b/>
+        </w:rPr>
+        <w:t xml:space="preserve">Disambiguation: </w:t>
+      </w:r>
+      <w:r>
+        <w:t>each code is tagged with its document type; because the two codes share article numbers, every answer states WHICH code a cited article belongs to.</w:t>
       </w:r>
     </w:p>
     <w:p>
@@ -1270,7 +1688,21 @@
           <w:i w:val="0"/>
           <w:sz w:val="22"/>
         </w:rPr>
-        <w:t>Built with Streamlit; it has three areas:</w:t>
+        <w:t>Built with Streamlit; it has four areas, selected from a collapsible sidebar:</w:t>
+      </w:r>
+    </w:p>
+    <w:p>
+      <w:pPr>
+        <w:pStyle w:val="ListBullet"/>
+      </w:pPr>
+      <w:r>
+        <w:rPr>
+          <w:b/>
+        </w:rPr>
+        <w:t xml:space="preserve">Chat Assistant: </w:t>
+      </w:r>
+      <w:r>
+        <w:t>the primary interface — a professional, multi-turn chat. The agentic orchestrator calls only the sub-agents it needs and shows them running LIVE, step by step (Research / Analysis / Citation). Answers render Markdown with correct right-to-left layout for Arabic. Each answer carries a light footer (sub-agent calls · latency · tokens · estimated spend · verified citations) and a collapsed, professional SOURCES panel — the exact articles/rulings used, each labelled with its code and marked when actually cited. Conversations are saved to disk (new chat, rename-by-first-question, delete) and survive restarts.</w:t>
       </w:r>
     </w:p>
     <w:p>
@@ -2978,7 +3410,7 @@
         <w:t xml:space="preserve">Model: </w:t>
       </w:r>
       <w:r>
-        <w:t>standardised on Claude Sonnet 4.5 (selectable: 4.6 / Opus / Haiku).</w:t>
+        <w:t>standardised on Claude Sonnet 5 (temperature 0, retrieval score threshold 0.7 by default); selectable per run — Sonnet 4.6 / 4.5, Opus 4.6, Haiku 4.5. Reasoning models that reject a temperature parameter and return content as blocks are handled transparently.</w:t>
       </w:r>
     </w:p>
     <w:p>
@@ -3073,7 +3505,7 @@
         <w:t xml:space="preserve">Limitations: </w:t>
       </w:r>
       <w:r>
-        <w:t>English/French retrieval lags Arabic (~40% vs. 72%); the corpus covers criminal (Penal) law only.</w:t>
+        <w:t>English/French retrieval lags Arabic (~40% vs. 72%); the corpus covers criminal law only (Penal Code + Code of Criminal Procedure), and the Criminal Procedure Code is Arabic-only for now (answers are still given in the user's language).</w:t>
       </w:r>
     </w:p>
     <w:p>

</xml_diff>